<commit_message>
Fix two grammar errors in paraphrased proposal
Co-Authored-By: Claude Opus 5.5 <noreply@anthropic.com>
Claude-Session: https://claude.ai/code/session_01XKRDA8eFMvanabK471ziSZ
</commit_message>
<xml_diff>
--- a/KAIMRC_No_Show_Proposal_Paraphrased.docx
+++ b/KAIMRC_No_Show_Proposal_Paraphrased.docx
@@ -545,7 +545,7 @@
         <w:rPr>
           <w:highlight w:val="green"/>
         </w:rPr>
-        <w:t xml:space="preserve">give the department better insight into</w:t>
+        <w:t xml:space="preserve">give the department a clearer picture</w:t>
       </w:r>
       <w:r>
         <w:t xml:space="preserve"> of missed appointment patterns and inform future initiatives addressing scheduling, reminder systems, communication with patients, and access to physical therapy services.</w:t>
@@ -1756,7 +1756,7 @@
         <w:rPr>
           <w:highlight w:val="green"/>
         </w:rPr>
-        <w:t xml:space="preserve">Data collection will begin only once</w:t>
+        <w:t xml:space="preserve">Data collection will commence only after</w:t>
       </w:r>
       <w:r>
         <w:t xml:space="preserve"> approval from the relevant KAIMRC/Institutional Review Board and completion of all required institutional permissions. Before the telephone questionnaire, potential participants will receive a concise explanation of the study and will be told that participation is voluntary, </w:t>

</xml_diff>